<commit_message>
Integrate interactive batch file user guide inside uploads panel, update changelogs, and compile document deliverables
</commit_message>
<xml_diff>
--- a/docs/CHANGELOG.docx
+++ b/docs/CHANGELOG.docx
@@ -155,6 +155,20 @@
           <w:sz w:val="21"/>
         </w:rPr>
         <w:t>**WPS Office User Manual Update**: Extended `User_Manual.md` and `User_Manual.docx` to document single CRUD actions, batch templates, and column type maps.</w:t>
+      </w:r>
+    </w:p>
+    <w:p>
+      <w:pPr>
+        <w:pStyle w:val="ListBullet"/>
+        <w:spacing w:before="0" w:after="40"/>
+      </w:pPr>
+      <w:r>
+        <w:rPr>
+          <w:rFonts w:ascii="Segoe UI" w:hAnsi="Segoe UI"/>
+          <w:color w:val="374151"/>
+          <w:sz w:val="21"/>
+        </w:rPr>
+        <w:t>**Dashboard In-App User Guide**: Integrated the Batch Upload User Guide card with column structure descriptions and a dynamic template download button directly into the Batch Upload Listing dashboard panel.</w:t>
       </w:r>
     </w:p>
     <w:p>

</xml_diff>

<commit_message>
Update profile form with split names, postpaid billing models, payment dropdowns, subscription cancellation, and conditional account deletion
</commit_message>
<xml_diff>
--- a/docs/CHANGELOG.docx
+++ b/docs/CHANGELOG.docx
@@ -169,6 +169,20 @@
           <w:sz w:val="21"/>
         </w:rPr>
         <w:t>**Dashboard In-App User Guide**: Integrated the Batch Upload User Guide card with column structure descriptions and a dynamic template download button directly into the Batch Upload Listing dashboard panel.</w:t>
+      </w:r>
+    </w:p>
+    <w:p>
+      <w:pPr>
+        <w:pStyle w:val="ListBullet"/>
+        <w:spacing w:before="0" w:after="40"/>
+      </w:pPr>
+      <w:r>
+        <w:rPr>
+          <w:rFonts w:ascii="Segoe UI" w:hAnsi="Segoe UI"/>
+          <w:color w:val="374151"/>
+          <w:sz w:val="21"/>
+        </w:rPr>
+        <w:t>**Merchant Profile &amp; Postpaid Billing Settings**: Implemented split first/last name inputs, postpaid plan selection, active payment method selectors, subscription cancellation hooks, and conditional deletion rules (blocks account deletion unless active plan is Free).</w:t>
       </w:r>
     </w:p>
     <w:p>

</xml_diff>

<commit_message>
Add Payment Tracking Ledger dashboard panel, insert mock payouts dataset, bind platform and search query filter routing, update test specs, and regenerate word outputs
</commit_message>
<xml_diff>
--- a/docs/CHANGELOG.docx
+++ b/docs/CHANGELOG.docx
@@ -183,6 +183,20 @@
           <w:sz w:val="21"/>
         </w:rPr>
         <w:t>**Merchant Profile &amp; Postpaid Billing Settings**: Implemented split first/last name inputs, postpaid plan selection, active payment method selectors, subscription cancellation hooks, and conditional deletion rules (blocks account deletion unless active plan is Free).</w:t>
+      </w:r>
+    </w:p>
+    <w:p>
+      <w:pPr>
+        <w:pStyle w:val="ListBullet"/>
+        <w:spacing w:before="0" w:after="40"/>
+      </w:pPr>
+      <w:r>
+        <w:rPr>
+          <w:rFonts w:ascii="Segoe UI" w:hAnsi="Segoe UI"/>
+          <w:color w:val="374151"/>
+          <w:sz w:val="21"/>
+        </w:rPr>
+        <w:t>**Payment/Payout Tracking Ledger**: Added a dedicated Payment Tracking sidebar tab listing expected payouts, platform fees deductions, and net settlements with live platform exclusions and status filtering.</w:t>
       </w:r>
     </w:p>
     <w:p>

</xml_diff>

<commit_message>
Add Order Management Dashboard tab, implement platform specific cancellation dropdown reason filters, simulate API accept/cancel synchronizations, and generate spooled thermal logs
</commit_message>
<xml_diff>
--- a/docs/CHANGELOG.docx
+++ b/docs/CHANGELOG.docx
@@ -197,6 +197,20 @@
           <w:sz w:val="21"/>
         </w:rPr>
         <w:t>**Payment/Payout Tracking Ledger**: Added a dedicated Payment Tracking sidebar tab listing expected payouts, platform fees deductions, and net settlements with live platform exclusions and status filtering.</w:t>
+      </w:r>
+    </w:p>
+    <w:p>
+      <w:pPr>
+        <w:pStyle w:val="ListBullet"/>
+        <w:spacing w:before="0" w:after="40"/>
+      </w:pPr>
+      <w:r>
+        <w:rPr>
+          <w:rFonts w:ascii="Segoe UI" w:hAnsi="Segoe UI"/>
+          <w:color w:val="374151"/>
+          <w:sz w:val="21"/>
+        </w:rPr>
+        <w:t>**Order Management Dashboard Tab**: Added a tab to accept orders, cancel transactions with mandatory platform-specific follow-up reasons, and spooled thermal printing logs for AWBs, invoices, and picklists, all simulated via dynamic platform API mock parameters.</w:t>
       </w:r>
     </w:p>
     <w:p>

</xml_diff>